<commit_message>
Remove Dealio.pro/SendFuse names from all client-facing surfaces; formalize comps PDF preservation workflow
</commit_message>
<xml_diff>
--- a/product-templates/Newtree_Product_Methodology_Overview.docx
+++ b/product-templates/Newtree_Product_Methodology_Overview.docx
@@ -439,7 +439,7 @@
           <w:sz w:val="21"/>
           <w:szCs w:val="21"/>
         </w:rPr>
-        <w:t>Used before a lender term sheet exists and before a contractor has bid the rehab. Answers one question fast: is this worth spending real time on? No loan terms, no itemized rehab, no partner waterfall — just a 70% Rule maximum-offer calculation, a rough profit estimate, and a verdict. Every input is tagged with where it came from (county assessor, SendFuse, Dealio.pro) so the screen can be trusted or challenged later. This is the wholesaler tier — for a wholesaler, this level of analysis is the entire product, used to both evaluate and market a contract, since they never hire a contractor or a lender themselves.</w:t>
+        <w:t>Used before a lender term sheet exists and before a contractor has bid the rehab. Answers one question fast: is this worth spending real time on? No loan terms, no itemized rehab, no partner waterfall — just a 70% Rule maximum-offer calculation, a rough profit estimate, and a verdict. Every input is tagged with where it came from (county assessor, Property Profile source, Comps source) so the screen can be trusted or challenged later. This is the wholesaler tier — for a wholesaler, this level of analysis is the entire product, used to both evaluate and market a contract, since they never hire a contractor or a lender themselves.</w:t>
       </w:r>
     </w:p>
     <w:p>
@@ -1078,18 +1078,7 @@
           <w:sz w:val="24"/>
           <w:szCs w:val="24"/>
         </w:rPr>
-        <w:t>“</w:t>
-      </w:r>
-      <w:r>
-        <w:rPr>
-          <w:rFonts w:eastAsia="Calibri" w:cs="Calibri" w:ascii="Calibri" w:hAnsi="Calibri"/>
-          <w:b/>
-          <w:bCs/>
-          <w:color w:val="19262B"/>
-          <w:sz w:val="24"/>
-          <w:szCs w:val="24"/>
-        </w:rPr>
-        <w:t>Prepared For”</w:t>
+        <w:t>“Prepared For”</w:t>
       </w:r>
     </w:p>
     <w:p>
@@ -2051,7 +2040,7 @@
                 <w:sz w:val="19"/>
                 <w:szCs w:val="19"/>
               </w:rPr>
-              <w:t>Dealio.pro / LeadPipes</w:t>
+              <w:t>Comps &amp; Skip-Trace Source</w:t>
             </w:r>
           </w:p>
         </w:tc>
@@ -2141,7 +2130,7 @@
                 <w:sz w:val="19"/>
                 <w:szCs w:val="19"/>
               </w:rPr>
-              <w:t>SendFuse</w:t>
+              <w:t>Property Profile Source</w:t>
             </w:r>
           </w:p>
         </w:tc>
@@ -2199,7 +2188,7 @@
           <w:sz w:val="21"/>
           <w:szCs w:val="21"/>
         </w:rPr>
-        <w:t>This hierarchy isn't academic — it caught a real, ~3-year-stale owner name on a live deal (Dealio showed the prior owner; the county record showed the actual current owner, reached via a $0 internal portfolio transfer Dealio never picked up). County and SendFuse/Dealio.pro data are pulled live through a connected browser session, since none of these platforms expose a public API; every pulled figure is logged with its source, a pull date, and a report reference on a Source Log tab so any number in a deliverable can be traced back to where it came from.</w:t>
+        <w:t>This hierarchy isn't academic — it caught a real, ~3-year-stale owner name on a live deal (the comps/skip-trace source showed the prior owner; the county record showed the actual current owner, reached via a $0 internal portfolio transfer the comps/skip-trace source never picked up). County and property/comps source data are pulled live through a connected browser session, since none of these platforms expose a public API; every pulled figure is logged with its source, a pull date, and a report reference on a Source Log tab so any number in a deliverable can be traced back to where it came from.</w:t>
       </w:r>
     </w:p>
     <w:p>

</xml_diff>